<commit_message>
docs: finalize full thesis report overhaul chapters 2 to 5 for Nhom 21
</commit_message>
<xml_diff>
--- a/Nhóm-Lớp-KẾ HOẠCH THỰC HIỆN ĐỒ ÁN.docx
+++ b/Nhóm-Lớp-KẾ HOẠCH THỰC HIỆN ĐỒ ÁN.docx
@@ -63,7 +63,7 @@
           <w:b/>
           <w:sz w:val="28"/>
         </w:rPr>
-        <w:t>Nhóm: Nhóm 05</w:t>
+        <w:t>Nhóm: Nhóm 21</w:t>
       </w:r>
     </w:p>
     <w:p>
@@ -96,7 +96,7 @@
           <w:b/>
           <w:sz w:val="28"/>
         </w:rPr>
-        <w:t>:................................</w:t>
+        <w:t>:Đồ án chuyên ngành CNPM-1-1-26(N05) - DCCNTT.14.5</w:t>
       </w:r>
     </w:p>
     <w:p>

</xml_diff>